<commit_message>
Update AZ-MVS proposal pricing to align with rate card and small-business benchmarks
- Per-site visit rate: 50 (inside published Site Survey 50-00 band)
- Per-tag rate: bash.75
- Base project total: 3,600 (was 3,250)
- Optional software: 00/mo or ,200/year
- Optional annual re-inventory: 00/site (,200/year)
- Add PRICING-ANALYSIS.md with local competitor comparisons

Co-Authored-By: Devin AI <158243242+devin-ai-integration[bot]@users.noreply.github.com>
</commit_message>
<xml_diff>
--- a/docs/proposals/2026-08-11-az-mvs-asset-inventory/PROPOSAL.docx
+++ b/docs/proposals/2026-08-11-az-mvs-asset-inventory/PROPOSAL.docx
@@ -99,7 +99,7 @@
         <w:rPr>
           <w:b w:val="0"/>
         </w:rPr>
-        <w:t>Our base one-time price for the full scope is $13,250 (assuming approximately 700 tagged assets; the site-visit and processing components are fixed, and tags are priced per actual unit). This is an all-in cost of approximately $18.93 per tagged asset at the 700-asset estimate.</w:t>
+        <w:t>Our base one-time price for the full scope is $13,600 (assuming approximately 700 tagged assets; the site-visit and processing components are fixed, and tags are priced per actual unit). This is an all-in cost of approximately $19.43 per tagged asset at the 700-asset estimate. Pricing is anchored to our published rate card and compared against local small-business IT service rates, not national firms.</w:t>
       </w:r>
     </w:p>
     <w:p/>
@@ -267,7 +267,7 @@
         <w:pStyle w:val="ListBullet"/>
       </w:pPr>
       <w:r>
-        <w:t>PawnCo P4 option: if exercised, a separate pre-opening sweep after equipment is staged/installed, tagged and registered at $500 per sweep plus $1.25 per tag.</w:t>
+        <w:t>PawnCo P4 option: if exercised, a separate pre-opening sweep after equipment is staged/installed, tagged and registered at $500 per sweep plus $0.75 per tag.</w:t>
       </w:r>
     </w:p>
     <w:p>
@@ -339,7 +339,7 @@
         <w:pStyle w:val="ListBullet"/>
       </w:pPr>
       <w:r>
-        <w:t>Replacement: lost or damaged tags replaced at $1.25 each during the project; after project closeout, replacement tags available at the same rate plus a dispatch fee.</w:t>
+        <w:t>Replacement: lost or damaged tags replaced at $0.75 each during the project; after project closeout, replacement tags available at the same rate plus a dispatch fee.</w:t>
       </w:r>
     </w:p>
     <w:p>
@@ -2149,7 +2149,7 @@
           </w:tcPr>
           <w:p>
             <w:r>
-              <w:t>$425.00/visit</w:t>
+              <w:t>$450.00/visit</w:t>
             </w:r>
           </w:p>
         </w:tc>
@@ -2159,7 +2159,7 @@
           </w:tcPr>
           <w:p>
             <w:r>
-              <w:t>$10,200.00</w:t>
+              <w:t>$10,800.00</w:t>
             </w:r>
           </w:p>
         </w:tc>
@@ -2191,7 +2191,7 @@
           </w:tcPr>
           <w:p>
             <w:r>
-              <w:t>$1.25/tag</w:t>
+              <w:t>$0.75/tag</w:t>
             </w:r>
           </w:p>
         </w:tc>
@@ -2201,7 +2201,7 @@
           </w:tcPr>
           <w:p>
             <w:r>
-              <w:t>~$875.00 (est. 700 tags)</w:t>
+              <w:t>~$525.00 (est. 700 tags)</w:t>
             </w:r>
           </w:p>
         </w:tc>
@@ -2411,7 +2411,7 @@
           </w:tcPr>
           <w:p>
             <w:r>
-              <w:t>$13,250.00</w:t>
+              <w:t>$13,575.00</w:t>
             </w:r>
           </w:p>
         </w:tc>
@@ -2423,7 +2423,7 @@
         <w:rPr>
           <w:b w:val="0"/>
         </w:rPr>
-        <w:t>Assumed total asset count: approximately 700 tagged assets across 24 physical site visits. Estimated all-in cost per tagged asset: ~$18.93 at 700 assets; ~$17.24 at 800 assets; ~$20.75 at 600 assets. Proposal validity: 30 days. Payment terms: Net 15, 50% on kickoff and 50% on final delivery. Base scope not to exceed $15,000 without a written change order.</w:t>
+        <w:t>Assumed total asset count: approximately 700 tagged assets across 24 physical site visits. Estimated all-in cost per tagged asset: ~$19.43 at 700 assets; ~$17.00 at 800 assets; ~$22.67 at 600 assets. Rounded proposal total: $13,600. Proposal validity: 30 days. Payment terms: Net 15, 50% on kickoff and 50% on final delivery. Base scope not to exceed $14,750 without a written change order.</w:t>
       </w:r>
     </w:p>
     <w:p>
@@ -2503,7 +2503,7 @@
           </w:tcPr>
           <w:p>
             <w:r>
-              <w:t>$800/year or $75/month</w:t>
+              <w:t>$1,200/year or $100/month</w:t>
             </w:r>
           </w:p>
         </w:tc>
@@ -2535,7 +2535,7 @@
           </w:tcPr>
           <w:p>
             <w:r>
-              <w:t>$7,800/year ($325/site x 24)</w:t>
+              <w:t>$7,200/year ($300/site x 24)</w:t>
             </w:r>
           </w:p>
         </w:tc>
@@ -2567,7 +2567,7 @@
           </w:tcPr>
           <w:p>
             <w:r>
-              <w:t>$500 per visit + $1.25/tag</w:t>
+              <w:t>$500 per visit + $0.75/tag</w:t>
             </w:r>
           </w:p>
         </w:tc>

</xml_diff>

<commit_message>
Add mobilization/equipment recovery cost to AZ-MVS bid
- Adds 7/site mobilization & first-job equipment recovery line to BID-FORM, SOW, README, PRICING-ANALYSIS, and PROPOSAL.docx
- Raises base proposal to 5,200 and not-to-exceed to 6,500
- Updates internal margin estimate: ~,649 (~50%) gross margin after full equipment purchase

Co-Authored-By: Devin AI <158243242+devin-ai-integration[bot]@users.noreply.github.com>
</commit_message>
<xml_diff>
--- a/docs/proposals/2026-08-11-az-mvs-asset-inventory/PROPOSAL.docx
+++ b/docs/proposals/2026-08-11-az-mvs-asset-inventory/PROPOSAL.docx
@@ -99,7 +99,7 @@
         <w:rPr>
           <w:b w:val="0"/>
         </w:rPr>
-        <w:t>Our base one-time price for the full scope is $13,600 (assuming approximately 700 tagged assets; the site-visit and processing components are fixed, and tags are priced per actual unit). This is an all-in cost of approximately $19.43 per tagged asset at the 700-asset estimate. Pricing is anchored to our published rate card and compared against local small-business IT service rates, not national firms.</w:t>
+        <w:t>Our base one-time price for the full scope is $15,200 (assuming approximately 700 tagged assets; the site-visit, mobilization, and processing components are fixed, and tags are priced per actual unit). This is an all-in cost of approximately $21.71 per tagged asset at the 700-asset estimate. Pricing is anchored to our published rate card and compared against local small-business IT service rates, not national firms.</w:t>
       </w:r>
     </w:p>
     <w:p/>
@@ -2171,6 +2171,48 @@
           </w:tcPr>
           <w:p>
             <w:r>
+              <w:t>Mobilization &amp; first-job equipment recovery</w:t>
+            </w:r>
+          </w:p>
+        </w:tc>
+        <w:tc>
+          <w:tcPr>
+            <w:tcW w:type="dxa" w:w="2160"/>
+          </w:tcPr>
+          <w:p>
+            <w:r>
+              <w:t>24 site visits</w:t>
+            </w:r>
+          </w:p>
+        </w:tc>
+        <w:tc>
+          <w:tcPr>
+            <w:tcW w:type="dxa" w:w="2160"/>
+          </w:tcPr>
+          <w:p>
+            <w:r>
+              <w:t>$67.00/visit</w:t>
+            </w:r>
+          </w:p>
+        </w:tc>
+        <w:tc>
+          <w:tcPr>
+            <w:tcW w:type="dxa" w:w="2160"/>
+          </w:tcPr>
+          <w:p>
+            <w:r>
+              <w:t>$1,608.00</w:t>
+            </w:r>
+          </w:p>
+        </w:tc>
+      </w:tr>
+      <w:tr>
+        <w:tc>
+          <w:tcPr>
+            <w:tcW w:type="dxa" w:w="2160"/>
+          </w:tcPr>
+          <w:p>
+            <w:r>
               <w:t>Asset tags</w:t>
             </w:r>
           </w:p>
@@ -2297,7 +2339,7 @@
           </w:tcPr>
           <w:p>
             <w:r>
-              <w:t>Travel / mobilization</w:t>
+              <w:t>Travel / mileage</w:t>
             </w:r>
           </w:p>
         </w:tc>
@@ -2317,7 +2359,7 @@
           </w:tcPr>
           <w:p>
             <w:r>
-              <w:t>Included</w:t>
+              <w:t>Included in mobilization</w:t>
             </w:r>
           </w:p>
         </w:tc>
@@ -2411,7 +2453,7 @@
           </w:tcPr>
           <w:p>
             <w:r>
-              <w:t>$13,575.00</w:t>
+              <w:t>$15,183.00</w:t>
             </w:r>
           </w:p>
         </w:tc>
@@ -2423,7 +2465,7 @@
         <w:rPr>
           <w:b w:val="0"/>
         </w:rPr>
-        <w:t>Assumed total asset count: approximately 700 tagged assets across 24 physical site visits. Estimated all-in cost per tagged asset: ~$19.43 at 700 assets; ~$17.00 at 800 assets; ~$22.67 at 600 assets. Rounded proposal total: $13,600. Proposal validity: 30 days. Payment terms: Net 15, 50% on kickoff and 50% on final delivery. Base scope not to exceed $14,750 without a written change order.</w:t>
+        <w:t>Assumed total asset count: approximately 700 tagged assets across 24 physical site visits. Estimated all-in cost per tagged asset: ~$21.71 at 700 assets; ~$19.00 at 800 assets; ~$25.33 at 600 assets. Rounded proposal total: $15,200. Proposal validity: 30 days. Payment terms: Net 15, 50% on kickoff and 50% on final delivery. Base scope not to exceed $16,500 without a written change order.</w:t>
       </w:r>
     </w:p>
     <w:p>

</xml_diff>

<commit_message>
Raise AZ-MVS tag price to .25 and update proposal total to 5,600
- Asset tags: bash.75 → .25 each (700 tags = 75)
- Base proposal total: 5,558; rounded client total: 5,600
- Updated BID-FORM, SOW, README, PRICING-ANALYSIS, and PROPOSAL.docx
- PawnCo P4 and replacement tags also use .25 for consistency
- Internal margin now ~,049 (~51.6%) after full equipment purchase

Co-Authored-By: Devin AI <158243242+devin-ai-integration[bot]@users.noreply.github.com>
</commit_message>
<xml_diff>
--- a/docs/proposals/2026-08-11-az-mvs-asset-inventory/PROPOSAL.docx
+++ b/docs/proposals/2026-08-11-az-mvs-asset-inventory/PROPOSAL.docx
@@ -99,7 +99,7 @@
         <w:rPr>
           <w:b w:val="0"/>
         </w:rPr>
-        <w:t>Our base one-time price for the full scope is $15,200 (assuming approximately 700 tagged assets; the site-visit, mobilization, and processing components are fixed, and tags are priced per actual unit). This is an all-in cost of approximately $21.71 per tagged asset at the 700-asset estimate. Pricing is anchored to our published rate card and compared against local small-business IT service rates, not national firms.</w:t>
+        <w:t>Our base one-time price for the full scope is $15,600 (assuming approximately 700 tagged assets; the site-visit, mobilization, and processing components are fixed, and tags are priced per actual unit). This is an all-in cost of approximately $22.29 per tagged asset at the 700-asset estimate. Pricing is anchored to our published rate card and compared against local small-business IT service rates, not national firms.</w:t>
       </w:r>
     </w:p>
     <w:p/>
@@ -267,7 +267,7 @@
         <w:pStyle w:val="ListBullet"/>
       </w:pPr>
       <w:r>
-        <w:t>PawnCo P4 option: if exercised, a separate pre-opening sweep after equipment is staged/installed, tagged and registered at $500 per sweep plus $0.75 per tag.</w:t>
+        <w:t>PawnCo P4 option: if exercised, a separate pre-opening sweep after equipment is staged/installed, tagged and registered at $500 per sweep plus $1.25 per tag.</w:t>
       </w:r>
     </w:p>
     <w:p>
@@ -339,7 +339,7 @@
         <w:pStyle w:val="ListBullet"/>
       </w:pPr>
       <w:r>
-        <w:t>Replacement: lost or damaged tags replaced at $0.75 each during the project; after project closeout, replacement tags available at the same rate plus a dispatch fee.</w:t>
+        <w:t>Replacement: lost or damaged tags replaced at $1.25 each during the project; after project closeout, replacement tags available at the same rate plus a dispatch fee.</w:t>
       </w:r>
     </w:p>
     <w:p>
@@ -2233,7 +2233,7 @@
           </w:tcPr>
           <w:p>
             <w:r>
-              <w:t>$0.75/tag</w:t>
+              <w:t>$1.25/tag</w:t>
             </w:r>
           </w:p>
         </w:tc>
@@ -2243,7 +2243,7 @@
           </w:tcPr>
           <w:p>
             <w:r>
-              <w:t>~$525.00 (est. 700 tags)</w:t>
+              <w:t>~$875.00 (est. 700 tags)</w:t>
             </w:r>
           </w:p>
         </w:tc>
@@ -2453,7 +2453,7 @@
           </w:tcPr>
           <w:p>
             <w:r>
-              <w:t>$15,183.00</w:t>
+              <w:t>$15,558.00</w:t>
             </w:r>
           </w:p>
         </w:tc>
@@ -2465,7 +2465,7 @@
         <w:rPr>
           <w:b w:val="0"/>
         </w:rPr>
-        <w:t>Assumed total asset count: approximately 700 tagged assets across 24 physical site visits. Estimated all-in cost per tagged asset: ~$21.71 at 700 assets; ~$19.00 at 800 assets; ~$25.33 at 600 assets. Rounded proposal total: $15,200. Proposal validity: 30 days. Payment terms: Net 15, 50% on kickoff and 50% on final delivery. Base scope not to exceed $16,500 without a written change order.</w:t>
+        <w:t>Assumed total asset count: approximately 700 tagged assets across 24 physical site visits. Estimated all-in cost per tagged asset: ~$22.29 at 700 assets; ~$19.50 at 800 assets; ~$26.00 at 600 assets. Rounded proposal total: $15,600. Proposal validity: 30 days. Payment terms: Net 15, 50% on kickoff and 50% on final delivery. Base scope not to exceed $16,500 without a written change order.</w:t>
       </w:r>
     </w:p>
     <w:p>
@@ -2609,7 +2609,7 @@
           </w:tcPr>
           <w:p>
             <w:r>
-              <w:t>$500 per visit + $0.75/tag</w:t>
+              <w:t>$500 per visit + $1.25/tag</w:t>
             </w:r>
           </w:p>
         </w:tc>

</xml_diff>

<commit_message>
AZ-MVS proposal: make line items total exactly 5,600
Co-Authored-By: Devin AI <158243242+devin-ai-integration[bot]@users.noreply.github.com>
</commit_message>
<xml_diff>
--- a/docs/proposals/2026-08-11-az-mvs-asset-inventory/PROPOSAL.docx
+++ b/docs/proposals/2026-08-11-az-mvs-asset-inventory/PROPOSAL.docx
@@ -2191,7 +2191,7 @@
           </w:tcPr>
           <w:p>
             <w:r>
-              <w:t>$67.00/visit</w:t>
+              <w:t>fixed</w:t>
             </w:r>
           </w:p>
         </w:tc>
@@ -2201,7 +2201,7 @@
           </w:tcPr>
           <w:p>
             <w:r>
-              <w:t>$1,608.00</w:t>
+              <w:t>$1,675.00</w:t>
             </w:r>
           </w:p>
         </w:tc>
@@ -2423,7 +2423,7 @@
           </w:tcPr>
           <w:p>
             <w:r>
-              <w:t>TOTAL ONE-TIME PROJECT PRICE (base)</w:t>
+              <w:t>TOTAL ONE-TIME PROJECT PRICE</w:t>
             </w:r>
           </w:p>
         </w:tc>
@@ -2453,7 +2453,7 @@
           </w:tcPr>
           <w:p>
             <w:r>
-              <w:t>$15,558.00</w:t>
+              <w:t>$15,600.00</w:t>
             </w:r>
           </w:p>
         </w:tc>
@@ -2465,7 +2465,7 @@
         <w:rPr>
           <w:b w:val="0"/>
         </w:rPr>
-        <w:t>Assumed total asset count: approximately 700 tagged assets across 24 physical site visits. Estimated all-in cost per tagged asset: ~$22.29 at 700 assets; ~$19.50 at 800 assets; ~$26.00 at 600 assets. Rounded proposal total: $15,600. Proposal validity: 30 days. Payment terms: Net 15, 50% on kickoff and 50% on final delivery. Base scope not to exceed $16,500 without a written change order.</w:t>
+        <w:t>Assumed total asset count: approximately 700 tagged assets across 24 physical site visits. Estimated all-in cost per tagged asset: ~$22.29 at 700 assets; ~$19.50 at 800 assets; ~$26.00 at 600 assets. Total one-time project price: $15,600.00. Proposal validity: 30 days. Payment terms: Net 15, 50% on kickoff and 50% on final delivery. Base scope not to exceed $16,500 without a written change order.</w:t>
       </w:r>
     </w:p>
     <w:p>

</xml_diff>

<commit_message>
Raise AZ-MVS proposal to 17800 with return-visit and reschedule contingency allowance
Co-Authored-By: Devin AI <158243242+devin-ai-integration[bot]@users.noreply.github.com>
</commit_message>
<xml_diff>
--- a/docs/proposals/2026-08-11-az-mvs-asset-inventory/PROPOSAL.docx
+++ b/docs/proposals/2026-08-11-az-mvs-asset-inventory/PROPOSAL.docx
@@ -99,7 +99,7 @@
         <w:rPr>
           <w:b w:val="0"/>
         </w:rPr>
-        <w:t>Our base one-time price for the full scope is $15,600 (assuming approximately 700 tagged assets; the site-visit, mobilization, and processing components are fixed, and tags are priced per actual unit). This is an all-in cost of approximately $22.29 per tagged asset at the 700-asset estimate. Pricing is anchored to our published rate card and compared against both local small-business IT service rates and national fixed-asset inventory provider benchmarks.</w:t>
+        <w:t>Our base one-time price for the full scope is $17,800 (assuming approximately 700 tagged assets; the site-visit, mobilization, processing, and return-visit/contingency components are fixed, and tags are priced per actual unit). This is an all-in cost of approximately $25.43 per tagged asset at the 700-asset estimate. Pricing is anchored to our published rate card and compared against both local small-business IT service rates and national fixed-asset inventory provider benchmarks, and it includes a built-in allowance for return visits, complications, and reschedules that larger firms typically bill as extras.</w:t>
       </w:r>
     </w:p>
     <w:p/>
@@ -2297,6 +2297,48 @@
           </w:tcPr>
           <w:p>
             <w:r>
+              <w:t>Return visits, complications &amp; reschedule allowance</w:t>
+            </w:r>
+          </w:p>
+        </w:tc>
+        <w:tc>
+          <w:tcPr>
+            <w:tcW w:type="dxa" w:w="2160"/>
+          </w:tcPr>
+          <w:p>
+            <w:r>
+              <w:t>1 project</w:t>
+            </w:r>
+          </w:p>
+        </w:tc>
+        <w:tc>
+          <w:tcPr>
+            <w:tcW w:type="dxa" w:w="2160"/>
+          </w:tcPr>
+          <w:p>
+            <w:r>
+              <w:t>fixed</w:t>
+            </w:r>
+          </w:p>
+        </w:tc>
+        <w:tc>
+          <w:tcPr>
+            <w:tcW w:type="dxa" w:w="2160"/>
+          </w:tcPr>
+          <w:p>
+            <w:r>
+              <w:t>$2,200.00</w:t>
+            </w:r>
+          </w:p>
+        </w:tc>
+      </w:tr>
+      <w:tr>
+        <w:tc>
+          <w:tcPr>
+            <w:tcW w:type="dxa" w:w="2160"/>
+          </w:tcPr>
+          <w:p>
+            <w:r>
               <w:t>Photos</w:t>
             </w:r>
           </w:p>
@@ -2453,7 +2495,7 @@
           </w:tcPr>
           <w:p>
             <w:r>
-              <w:t>$15,600.00</w:t>
+              <w:t>$17,800.00</w:t>
             </w:r>
           </w:p>
         </w:tc>
@@ -2465,7 +2507,7 @@
         <w:rPr>
           <w:b w:val="0"/>
         </w:rPr>
-        <w:t>Assumed total asset count: approximately 700 tagged assets across 24 physical site visits. Estimated all-in cost per tagged asset: ~$22.29 at 700 assets; ~$19.50 at 800 assets; ~$26.00 at 600 assets. Total one-time project price: $15,600.00. Proposal validity: 30 days. Payment terms: Net 15, 50% on kickoff and 50% on final delivery. Base scope not to exceed $16,500 without a written change order.</w:t>
+        <w:t>Assumed total asset count: approximately 700 tagged assets across 24 physical site visits. Estimated all-in cost per tagged asset: ~$25.43 at 700 assets; ~$22.25 at 800 assets; ~$29.67 at 600 assets. Total one-time project price: $17,800.00. Proposal validity: 30 days. Payment terms: Net 15, 50% on kickoff and 50% on final delivery. Base scope not to exceed $18,500 without a written change order.</w:t>
       </w:r>
     </w:p>
     <w:p>

</xml_diff>

<commit_message>
Add flexible 12-day, 2-sites-per-day schedule to AZ-MVS proposal
Co-Authored-By: Devin AI <158243242+devin-ai-integration[bot]@users.noreply.github.com>
</commit_message>
<xml_diff>
--- a/docs/proposals/2026-08-11-az-mvs-asset-inventory/PROPOSAL.docx
+++ b/docs/proposals/2026-08-11-az-mvs-asset-inventory/PROPOSAL.docx
@@ -403,7 +403,7 @@
         <w:rPr>
           <w:b w:val="0"/>
         </w:rPr>
-        <w:t>Estimated duration: 4-5 weeks from kickoff to final deliverables. Estimated field days: 12-16 business days (2-3 sites per day). Estimated assets per technician per day: 30-50 assets, varying by site density and access.</w:t>
+        <w:t>Estimated duration: 3-6 weeks from kickoff to final deliverables, depending on the Client’s required completion date. Field work is planned as 12 field days of 2 sites per day, clustered by geography. The schedule can be compressed or stretched as needed. Estimated assets per technician per day: 30-50 assets, varying by site density and access.</w:t>
       </w:r>
     </w:p>
     <w:p>
@@ -419,7 +419,7 @@
         <w:rPr>
           <w:b w:val="0"/>
         </w:rPr>
-        <w:t>The following 24 physical site visits are based on the RFP master location schedule.</w:t>
+        <w:t>The following 24 physical site visits are based on the RFP master location schedule. Actual dates will be coordinated with the Client once the SOW is signed and the required completion date is confirmed.</w:t>
       </w:r>
     </w:p>
     <w:tbl>
@@ -2005,6 +2005,489 @@
         </w:tc>
       </w:tr>
     </w:tbl>
+    <w:p>
+      <w:r>
+        <w:rPr>
+          <w:b w:val="0"/>
+        </w:rPr>
+        <w:t>Proposed field schedule (dates to be coordinated with the Client):</w:t>
+      </w:r>
+    </w:p>
+    <w:tbl>
+      <w:tblPr>
+        <w:tblStyle w:val="TableGrid"/>
+        <w:tblW w:type="auto" w:w="0"/>
+        <w:tblLook w:firstColumn="1" w:firstRow="1" w:lastColumn="0" w:lastRow="0" w:noHBand="0" w:noVBand="1" w:val="04A0"/>
+      </w:tblPr>
+      <w:tblGrid>
+        <w:gridCol w:w="2880"/>
+        <w:gridCol w:w="2880"/>
+        <w:gridCol w:w="2880"/>
+      </w:tblGrid>
+      <w:tr>
+        <w:tc>
+          <w:tcPr>
+            <w:tcW w:type="dxa" w:w="2880"/>
+          </w:tcPr>
+          <w:p>
+            <w:r>
+              <w:rPr>
+                <w:b/>
+              </w:rPr>
+              <w:t>Field Day</w:t>
+            </w:r>
+          </w:p>
+        </w:tc>
+        <w:tc>
+          <w:tcPr>
+            <w:tcW w:type="dxa" w:w="2880"/>
+          </w:tcPr>
+          <w:p>
+            <w:r>
+              <w:rPr>
+                <w:b/>
+              </w:rPr>
+              <w:t>Proposed Sites</w:t>
+            </w:r>
+          </w:p>
+        </w:tc>
+        <w:tc>
+          <w:tcPr>
+            <w:tcW w:type="dxa" w:w="2880"/>
+          </w:tcPr>
+          <w:p>
+            <w:r>
+              <w:rPr>
+                <w:b/>
+              </w:rPr>
+              <w:t>Approx. Round-Trip Miles</w:t>
+            </w:r>
+          </w:p>
+        </w:tc>
+      </w:tr>
+      <w:tr>
+        <w:tc>
+          <w:tcPr>
+            <w:tcW w:type="dxa" w:w="2880"/>
+          </w:tcPr>
+          <w:p>
+            <w:r>
+              <w:t>1</w:t>
+            </w:r>
+          </w:p>
+        </w:tc>
+        <w:tc>
+          <w:tcPr>
+            <w:tcW w:type="dxa" w:w="2880"/>
+          </w:tcPr>
+          <w:p>
+            <w:r>
+              <w:t>MVS 10, Corporate Office</w:t>
+            </w:r>
+          </w:p>
+        </w:tc>
+        <w:tc>
+          <w:tcPr>
+            <w:tcW w:type="dxa" w:w="2880"/>
+          </w:tcPr>
+          <w:p>
+            <w:r>
+              <w:t>15.1</w:t>
+            </w:r>
+          </w:p>
+        </w:tc>
+      </w:tr>
+      <w:tr>
+        <w:tc>
+          <w:tcPr>
+            <w:tcW w:type="dxa" w:w="2880"/>
+          </w:tcPr>
+          <w:p>
+            <w:r>
+              <w:t>2</w:t>
+            </w:r>
+          </w:p>
+        </w:tc>
+        <w:tc>
+          <w:tcPr>
+            <w:tcW w:type="dxa" w:w="2880"/>
+          </w:tcPr>
+          <w:p>
+            <w:r>
+              <w:t>MVS 32, MVS 20</w:t>
+            </w:r>
+          </w:p>
+        </w:tc>
+        <w:tc>
+          <w:tcPr>
+            <w:tcW w:type="dxa" w:w="2880"/>
+          </w:tcPr>
+          <w:p>
+            <w:r>
+              <w:t>26.2</w:t>
+            </w:r>
+          </w:p>
+        </w:tc>
+      </w:tr>
+      <w:tr>
+        <w:tc>
+          <w:tcPr>
+            <w:tcW w:type="dxa" w:w="2880"/>
+          </w:tcPr>
+          <w:p>
+            <w:r>
+              <w:t>3</w:t>
+            </w:r>
+          </w:p>
+        </w:tc>
+        <w:tc>
+          <w:tcPr>
+            <w:tcW w:type="dxa" w:w="2880"/>
+          </w:tcPr>
+          <w:p>
+            <w:r>
+              <w:t>MVS 28, MVS 13</w:t>
+            </w:r>
+          </w:p>
+        </w:tc>
+        <w:tc>
+          <w:tcPr>
+            <w:tcW w:type="dxa" w:w="2880"/>
+          </w:tcPr>
+          <w:p>
+            <w:r>
+              <w:t>33.8</w:t>
+            </w:r>
+          </w:p>
+        </w:tc>
+      </w:tr>
+      <w:tr>
+        <w:tc>
+          <w:tcPr>
+            <w:tcW w:type="dxa" w:w="2880"/>
+          </w:tcPr>
+          <w:p>
+            <w:r>
+              <w:t>4</w:t>
+            </w:r>
+          </w:p>
+        </w:tc>
+        <w:tc>
+          <w:tcPr>
+            <w:tcW w:type="dxa" w:w="2880"/>
+          </w:tcPr>
+          <w:p>
+            <w:r>
+              <w:t>MVS 51 / Motor Carrier, PawnCo P4 - Thunderbird</w:t>
+            </w:r>
+          </w:p>
+        </w:tc>
+        <w:tc>
+          <w:tcPr>
+            <w:tcW w:type="dxa" w:w="2880"/>
+          </w:tcPr>
+          <w:p>
+            <w:r>
+              <w:t>29.7</w:t>
+            </w:r>
+          </w:p>
+        </w:tc>
+      </w:tr>
+      <w:tr>
+        <w:tc>
+          <w:tcPr>
+            <w:tcW w:type="dxa" w:w="2880"/>
+          </w:tcPr>
+          <w:p>
+            <w:r>
+              <w:t>5</w:t>
+            </w:r>
+          </w:p>
+        </w:tc>
+        <w:tc>
+          <w:tcPr>
+            <w:tcW w:type="dxa" w:w="2880"/>
+          </w:tcPr>
+          <w:p>
+            <w:r>
+              <w:t>MVS 29, MVS 05</w:t>
+            </w:r>
+          </w:p>
+        </w:tc>
+        <w:tc>
+          <w:tcPr>
+            <w:tcW w:type="dxa" w:w="2880"/>
+          </w:tcPr>
+          <w:p>
+            <w:r>
+              <w:t>46.8</w:t>
+            </w:r>
+          </w:p>
+        </w:tc>
+      </w:tr>
+      <w:tr>
+        <w:tc>
+          <w:tcPr>
+            <w:tcW w:type="dxa" w:w="2880"/>
+          </w:tcPr>
+          <w:p>
+            <w:r>
+              <w:t>6</w:t>
+            </w:r>
+          </w:p>
+        </w:tc>
+        <w:tc>
+          <w:tcPr>
+            <w:tcW w:type="dxa" w:w="2880"/>
+          </w:tcPr>
+          <w:p>
+            <w:r>
+              <w:t>MVS 14, MVS 26</w:t>
+            </w:r>
+          </w:p>
+        </w:tc>
+        <w:tc>
+          <w:tcPr>
+            <w:tcW w:type="dxa" w:w="2880"/>
+          </w:tcPr>
+          <w:p>
+            <w:r>
+              <w:t>47.8</w:t>
+            </w:r>
+          </w:p>
+        </w:tc>
+      </w:tr>
+      <w:tr>
+        <w:tc>
+          <w:tcPr>
+            <w:tcW w:type="dxa" w:w="2880"/>
+          </w:tcPr>
+          <w:p>
+            <w:r>
+              <w:t>7</w:t>
+            </w:r>
+          </w:p>
+        </w:tc>
+        <w:tc>
+          <w:tcPr>
+            <w:tcW w:type="dxa" w:w="2880"/>
+          </w:tcPr>
+          <w:p>
+            <w:r>
+              <w:t>PawnCo P2, MVS 23</w:t>
+            </w:r>
+          </w:p>
+        </w:tc>
+        <w:tc>
+          <w:tcPr>
+            <w:tcW w:type="dxa" w:w="2880"/>
+          </w:tcPr>
+          <w:p>
+            <w:r>
+              <w:t>64.7</w:t>
+            </w:r>
+          </w:p>
+        </w:tc>
+      </w:tr>
+      <w:tr>
+        <w:tc>
+          <w:tcPr>
+            <w:tcW w:type="dxa" w:w="2880"/>
+          </w:tcPr>
+          <w:p>
+            <w:r>
+              <w:t>8</w:t>
+            </w:r>
+          </w:p>
+        </w:tc>
+        <w:tc>
+          <w:tcPr>
+            <w:tcW w:type="dxa" w:w="2880"/>
+          </w:tcPr>
+          <w:p>
+            <w:r>
+              <w:t>PawnCo P3, MVS 24</w:t>
+            </w:r>
+          </w:p>
+        </w:tc>
+        <w:tc>
+          <w:tcPr>
+            <w:tcW w:type="dxa" w:w="2880"/>
+          </w:tcPr>
+          <w:p>
+            <w:r>
+              <w:t>53.7</w:t>
+            </w:r>
+          </w:p>
+        </w:tc>
+      </w:tr>
+      <w:tr>
+        <w:tc>
+          <w:tcPr>
+            <w:tcW w:type="dxa" w:w="2880"/>
+          </w:tcPr>
+          <w:p>
+            <w:r>
+              <w:t>9</w:t>
+            </w:r>
+          </w:p>
+        </w:tc>
+        <w:tc>
+          <w:tcPr>
+            <w:tcW w:type="dxa" w:w="2880"/>
+          </w:tcPr>
+          <w:p>
+            <w:r>
+              <w:t>MVS 12, MVS 27</w:t>
+            </w:r>
+          </w:p>
+        </w:tc>
+        <w:tc>
+          <w:tcPr>
+            <w:tcW w:type="dxa" w:w="2880"/>
+          </w:tcPr>
+          <w:p>
+            <w:r>
+              <w:t>65.1</w:t>
+            </w:r>
+          </w:p>
+        </w:tc>
+      </w:tr>
+      <w:tr>
+        <w:tc>
+          <w:tcPr>
+            <w:tcW w:type="dxa" w:w="2880"/>
+          </w:tcPr>
+          <w:p>
+            <w:r>
+              <w:t>10</w:t>
+            </w:r>
+          </w:p>
+        </w:tc>
+        <w:tc>
+          <w:tcPr>
+            <w:tcW w:type="dxa" w:w="2880"/>
+          </w:tcPr>
+          <w:p>
+            <w:r>
+              <w:t>The Grove Restaurant &amp; Bar, MVS 16</w:t>
+            </w:r>
+          </w:p>
+        </w:tc>
+        <w:tc>
+          <w:tcPr>
+            <w:tcW w:type="dxa" w:w="2880"/>
+          </w:tcPr>
+          <w:p>
+            <w:r>
+              <w:t>79.0</w:t>
+            </w:r>
+          </w:p>
+        </w:tc>
+      </w:tr>
+      <w:tr>
+        <w:tc>
+          <w:tcPr>
+            <w:tcW w:type="dxa" w:w="2880"/>
+          </w:tcPr>
+          <w:p>
+            <w:r>
+              <w:t>11</w:t>
+            </w:r>
+          </w:p>
+        </w:tc>
+        <w:tc>
+          <w:tcPr>
+            <w:tcW w:type="dxa" w:w="2880"/>
+          </w:tcPr>
+          <w:p>
+            <w:r>
+              <w:t>MVS 34, MVS 22</w:t>
+            </w:r>
+          </w:p>
+        </w:tc>
+        <w:tc>
+          <w:tcPr>
+            <w:tcW w:type="dxa" w:w="2880"/>
+          </w:tcPr>
+          <w:p>
+            <w:r>
+              <w:t>84.8</w:t>
+            </w:r>
+          </w:p>
+        </w:tc>
+      </w:tr>
+      <w:tr>
+        <w:tc>
+          <w:tcPr>
+            <w:tcW w:type="dxa" w:w="2880"/>
+          </w:tcPr>
+          <w:p>
+            <w:r>
+              <w:t>12</w:t>
+            </w:r>
+          </w:p>
+        </w:tc>
+        <w:tc>
+          <w:tcPr>
+            <w:tcW w:type="dxa" w:w="2880"/>
+          </w:tcPr>
+          <w:p>
+            <w:r>
+              <w:t>MVS 33, PawnCo P1</w:t>
+            </w:r>
+          </w:p>
+        </w:tc>
+        <w:tc>
+          <w:tcPr>
+            <w:tcW w:type="dxa" w:w="2880"/>
+          </w:tcPr>
+          <w:p>
+            <w:r>
+              <w:t>100.6</w:t>
+            </w:r>
+          </w:p>
+        </w:tc>
+      </w:tr>
+      <w:tr>
+        <w:tc>
+          <w:tcPr>
+            <w:tcW w:type="dxa" w:w="2880"/>
+          </w:tcPr>
+          <w:p>
+            <w:r>
+              <w:t>Total</w:t>
+            </w:r>
+          </w:p>
+        </w:tc>
+        <w:tc>
+          <w:tcPr>
+            <w:tcW w:type="dxa" w:w="2880"/>
+          </w:tcPr>
+          <w:p>
+            <w:r/>
+          </w:p>
+        </w:tc>
+        <w:tc>
+          <w:tcPr>
+            <w:tcW w:type="dxa" w:w="2880"/>
+          </w:tcPr>
+          <w:p>
+            <w:r>
+              <w:t>647.4</w:t>
+            </w:r>
+          </w:p>
+        </w:tc>
+      </w:tr>
+    </w:tbl>
+    <w:p>
+      <w:r>
+        <w:rPr>
+          <w:b w:val="0"/>
+        </w:rPr>
+        <w:t>Travel is included in the fixed project price. PawnCo P4 will be scheduled separately if the pre-opening option is exercised.</w:t>
+      </w:r>
+    </w:p>
     <w:p/>
     <w:p>
       <w:pPr>

</xml_diff>

<commit_message>
Stretch AZ-MVS field schedule to up to 24 business days with optional weekends
Co-Authored-By: Devin AI <158243242+devin-ai-integration[bot]@users.noreply.github.com>
</commit_message>
<xml_diff>
--- a/docs/proposals/2026-08-11-az-mvs-asset-inventory/PROPOSAL.docx
+++ b/docs/proposals/2026-08-11-az-mvs-asset-inventory/PROPOSAL.docx
@@ -403,7 +403,7 @@
         <w:rPr>
           <w:b w:val="0"/>
         </w:rPr>
-        <w:t>Estimated duration: 3-6 weeks from kickoff to final deliverables, depending on the Client’s required completion date. Field work is planned as 12 field days of 2 sites per day, clustered by geography. The schedule can be compressed or stretched as needed. Estimated assets per technician per day: 30-50 assets, varying by site density and access.</w:t>
+        <w:t>Estimated duration: 4-6 weeks from kickoff to final deliverables, depending on the Client’s required completion date. Field work is planned as up to 24 business days at one site per day, grouped by geography to keep daily travel low. Two nearby sites may be paired on the same day if a tighter deadline is required. Weekend days may be used where site operating hours and security/access allow; weekend availability will be confirmed with each site contact during kickoff. Estimated assets per technician per day: 30-50 assets, varying by site density and access.</w:t>
       </w:r>
     </w:p>
     <w:p>
@@ -2010,476 +2010,9 @@
         <w:rPr>
           <w:b w:val="0"/>
         </w:rPr>
-        <w:t>Proposed field schedule (dates to be coordinated with the Client):</w:t>
+        <w:t>Proposed field schedule: one site per business day over up to 24 working days, sequenced by geography to keep daily travel low. Weekend days may be added where the site allows access; weekend availability will be confirmed with each site contact during kickoff. If the Client needs a tighter completion date, two nearby sites may be paired on a single day. A detailed day-by-day schedule will be finalized with the Client during kickoff.</w:t>
       </w:r>
     </w:p>
-    <w:tbl>
-      <w:tblPr>
-        <w:tblStyle w:val="TableGrid"/>
-        <w:tblW w:type="auto" w:w="0"/>
-        <w:tblLook w:firstColumn="1" w:firstRow="1" w:lastColumn="0" w:lastRow="0" w:noHBand="0" w:noVBand="1" w:val="04A0"/>
-      </w:tblPr>
-      <w:tblGrid>
-        <w:gridCol w:w="2880"/>
-        <w:gridCol w:w="2880"/>
-        <w:gridCol w:w="2880"/>
-      </w:tblGrid>
-      <w:tr>
-        <w:tc>
-          <w:tcPr>
-            <w:tcW w:type="dxa" w:w="2880"/>
-          </w:tcPr>
-          <w:p>
-            <w:r>
-              <w:rPr>
-                <w:b/>
-              </w:rPr>
-              <w:t>Field Day</w:t>
-            </w:r>
-          </w:p>
-        </w:tc>
-        <w:tc>
-          <w:tcPr>
-            <w:tcW w:type="dxa" w:w="2880"/>
-          </w:tcPr>
-          <w:p>
-            <w:r>
-              <w:rPr>
-                <w:b/>
-              </w:rPr>
-              <w:t>Proposed Sites</w:t>
-            </w:r>
-          </w:p>
-        </w:tc>
-        <w:tc>
-          <w:tcPr>
-            <w:tcW w:type="dxa" w:w="2880"/>
-          </w:tcPr>
-          <w:p>
-            <w:r>
-              <w:rPr>
-                <w:b/>
-              </w:rPr>
-              <w:t>Approx. Round-Trip Miles</w:t>
-            </w:r>
-          </w:p>
-        </w:tc>
-      </w:tr>
-      <w:tr>
-        <w:tc>
-          <w:tcPr>
-            <w:tcW w:type="dxa" w:w="2880"/>
-          </w:tcPr>
-          <w:p>
-            <w:r>
-              <w:t>1</w:t>
-            </w:r>
-          </w:p>
-        </w:tc>
-        <w:tc>
-          <w:tcPr>
-            <w:tcW w:type="dxa" w:w="2880"/>
-          </w:tcPr>
-          <w:p>
-            <w:r>
-              <w:t>MVS 10, Corporate Office</w:t>
-            </w:r>
-          </w:p>
-        </w:tc>
-        <w:tc>
-          <w:tcPr>
-            <w:tcW w:type="dxa" w:w="2880"/>
-          </w:tcPr>
-          <w:p>
-            <w:r>
-              <w:t>15.1</w:t>
-            </w:r>
-          </w:p>
-        </w:tc>
-      </w:tr>
-      <w:tr>
-        <w:tc>
-          <w:tcPr>
-            <w:tcW w:type="dxa" w:w="2880"/>
-          </w:tcPr>
-          <w:p>
-            <w:r>
-              <w:t>2</w:t>
-            </w:r>
-          </w:p>
-        </w:tc>
-        <w:tc>
-          <w:tcPr>
-            <w:tcW w:type="dxa" w:w="2880"/>
-          </w:tcPr>
-          <w:p>
-            <w:r>
-              <w:t>MVS 32, MVS 20</w:t>
-            </w:r>
-          </w:p>
-        </w:tc>
-        <w:tc>
-          <w:tcPr>
-            <w:tcW w:type="dxa" w:w="2880"/>
-          </w:tcPr>
-          <w:p>
-            <w:r>
-              <w:t>26.2</w:t>
-            </w:r>
-          </w:p>
-        </w:tc>
-      </w:tr>
-      <w:tr>
-        <w:tc>
-          <w:tcPr>
-            <w:tcW w:type="dxa" w:w="2880"/>
-          </w:tcPr>
-          <w:p>
-            <w:r>
-              <w:t>3</w:t>
-            </w:r>
-          </w:p>
-        </w:tc>
-        <w:tc>
-          <w:tcPr>
-            <w:tcW w:type="dxa" w:w="2880"/>
-          </w:tcPr>
-          <w:p>
-            <w:r>
-              <w:t>MVS 28, MVS 13</w:t>
-            </w:r>
-          </w:p>
-        </w:tc>
-        <w:tc>
-          <w:tcPr>
-            <w:tcW w:type="dxa" w:w="2880"/>
-          </w:tcPr>
-          <w:p>
-            <w:r>
-              <w:t>33.8</w:t>
-            </w:r>
-          </w:p>
-        </w:tc>
-      </w:tr>
-      <w:tr>
-        <w:tc>
-          <w:tcPr>
-            <w:tcW w:type="dxa" w:w="2880"/>
-          </w:tcPr>
-          <w:p>
-            <w:r>
-              <w:t>4</w:t>
-            </w:r>
-          </w:p>
-        </w:tc>
-        <w:tc>
-          <w:tcPr>
-            <w:tcW w:type="dxa" w:w="2880"/>
-          </w:tcPr>
-          <w:p>
-            <w:r>
-              <w:t>MVS 51 / Motor Carrier, PawnCo P4 - Thunderbird</w:t>
-            </w:r>
-          </w:p>
-        </w:tc>
-        <w:tc>
-          <w:tcPr>
-            <w:tcW w:type="dxa" w:w="2880"/>
-          </w:tcPr>
-          <w:p>
-            <w:r>
-              <w:t>29.7</w:t>
-            </w:r>
-          </w:p>
-        </w:tc>
-      </w:tr>
-      <w:tr>
-        <w:tc>
-          <w:tcPr>
-            <w:tcW w:type="dxa" w:w="2880"/>
-          </w:tcPr>
-          <w:p>
-            <w:r>
-              <w:t>5</w:t>
-            </w:r>
-          </w:p>
-        </w:tc>
-        <w:tc>
-          <w:tcPr>
-            <w:tcW w:type="dxa" w:w="2880"/>
-          </w:tcPr>
-          <w:p>
-            <w:r>
-              <w:t>MVS 29, MVS 05</w:t>
-            </w:r>
-          </w:p>
-        </w:tc>
-        <w:tc>
-          <w:tcPr>
-            <w:tcW w:type="dxa" w:w="2880"/>
-          </w:tcPr>
-          <w:p>
-            <w:r>
-              <w:t>46.8</w:t>
-            </w:r>
-          </w:p>
-        </w:tc>
-      </w:tr>
-      <w:tr>
-        <w:tc>
-          <w:tcPr>
-            <w:tcW w:type="dxa" w:w="2880"/>
-          </w:tcPr>
-          <w:p>
-            <w:r>
-              <w:t>6</w:t>
-            </w:r>
-          </w:p>
-        </w:tc>
-        <w:tc>
-          <w:tcPr>
-            <w:tcW w:type="dxa" w:w="2880"/>
-          </w:tcPr>
-          <w:p>
-            <w:r>
-              <w:t>MVS 14, MVS 26</w:t>
-            </w:r>
-          </w:p>
-        </w:tc>
-        <w:tc>
-          <w:tcPr>
-            <w:tcW w:type="dxa" w:w="2880"/>
-          </w:tcPr>
-          <w:p>
-            <w:r>
-              <w:t>47.8</w:t>
-            </w:r>
-          </w:p>
-        </w:tc>
-      </w:tr>
-      <w:tr>
-        <w:tc>
-          <w:tcPr>
-            <w:tcW w:type="dxa" w:w="2880"/>
-          </w:tcPr>
-          <w:p>
-            <w:r>
-              <w:t>7</w:t>
-            </w:r>
-          </w:p>
-        </w:tc>
-        <w:tc>
-          <w:tcPr>
-            <w:tcW w:type="dxa" w:w="2880"/>
-          </w:tcPr>
-          <w:p>
-            <w:r>
-              <w:t>PawnCo P2, MVS 23</w:t>
-            </w:r>
-          </w:p>
-        </w:tc>
-        <w:tc>
-          <w:tcPr>
-            <w:tcW w:type="dxa" w:w="2880"/>
-          </w:tcPr>
-          <w:p>
-            <w:r>
-              <w:t>64.7</w:t>
-            </w:r>
-          </w:p>
-        </w:tc>
-      </w:tr>
-      <w:tr>
-        <w:tc>
-          <w:tcPr>
-            <w:tcW w:type="dxa" w:w="2880"/>
-          </w:tcPr>
-          <w:p>
-            <w:r>
-              <w:t>8</w:t>
-            </w:r>
-          </w:p>
-        </w:tc>
-        <w:tc>
-          <w:tcPr>
-            <w:tcW w:type="dxa" w:w="2880"/>
-          </w:tcPr>
-          <w:p>
-            <w:r>
-              <w:t>PawnCo P3, MVS 24</w:t>
-            </w:r>
-          </w:p>
-        </w:tc>
-        <w:tc>
-          <w:tcPr>
-            <w:tcW w:type="dxa" w:w="2880"/>
-          </w:tcPr>
-          <w:p>
-            <w:r>
-              <w:t>53.7</w:t>
-            </w:r>
-          </w:p>
-        </w:tc>
-      </w:tr>
-      <w:tr>
-        <w:tc>
-          <w:tcPr>
-            <w:tcW w:type="dxa" w:w="2880"/>
-          </w:tcPr>
-          <w:p>
-            <w:r>
-              <w:t>9</w:t>
-            </w:r>
-          </w:p>
-        </w:tc>
-        <w:tc>
-          <w:tcPr>
-            <w:tcW w:type="dxa" w:w="2880"/>
-          </w:tcPr>
-          <w:p>
-            <w:r>
-              <w:t>MVS 12, MVS 27</w:t>
-            </w:r>
-          </w:p>
-        </w:tc>
-        <w:tc>
-          <w:tcPr>
-            <w:tcW w:type="dxa" w:w="2880"/>
-          </w:tcPr>
-          <w:p>
-            <w:r>
-              <w:t>65.1</w:t>
-            </w:r>
-          </w:p>
-        </w:tc>
-      </w:tr>
-      <w:tr>
-        <w:tc>
-          <w:tcPr>
-            <w:tcW w:type="dxa" w:w="2880"/>
-          </w:tcPr>
-          <w:p>
-            <w:r>
-              <w:t>10</w:t>
-            </w:r>
-          </w:p>
-        </w:tc>
-        <w:tc>
-          <w:tcPr>
-            <w:tcW w:type="dxa" w:w="2880"/>
-          </w:tcPr>
-          <w:p>
-            <w:r>
-              <w:t>The Grove Restaurant &amp; Bar, MVS 16</w:t>
-            </w:r>
-          </w:p>
-        </w:tc>
-        <w:tc>
-          <w:tcPr>
-            <w:tcW w:type="dxa" w:w="2880"/>
-          </w:tcPr>
-          <w:p>
-            <w:r>
-              <w:t>79.0</w:t>
-            </w:r>
-          </w:p>
-        </w:tc>
-      </w:tr>
-      <w:tr>
-        <w:tc>
-          <w:tcPr>
-            <w:tcW w:type="dxa" w:w="2880"/>
-          </w:tcPr>
-          <w:p>
-            <w:r>
-              <w:t>11</w:t>
-            </w:r>
-          </w:p>
-        </w:tc>
-        <w:tc>
-          <w:tcPr>
-            <w:tcW w:type="dxa" w:w="2880"/>
-          </w:tcPr>
-          <w:p>
-            <w:r>
-              <w:t>MVS 34, MVS 22</w:t>
-            </w:r>
-          </w:p>
-        </w:tc>
-        <w:tc>
-          <w:tcPr>
-            <w:tcW w:type="dxa" w:w="2880"/>
-          </w:tcPr>
-          <w:p>
-            <w:r>
-              <w:t>84.8</w:t>
-            </w:r>
-          </w:p>
-        </w:tc>
-      </w:tr>
-      <w:tr>
-        <w:tc>
-          <w:tcPr>
-            <w:tcW w:type="dxa" w:w="2880"/>
-          </w:tcPr>
-          <w:p>
-            <w:r>
-              <w:t>12</w:t>
-            </w:r>
-          </w:p>
-        </w:tc>
-        <w:tc>
-          <w:tcPr>
-            <w:tcW w:type="dxa" w:w="2880"/>
-          </w:tcPr>
-          <w:p>
-            <w:r>
-              <w:t>MVS 33, PawnCo P1</w:t>
-            </w:r>
-          </w:p>
-        </w:tc>
-        <w:tc>
-          <w:tcPr>
-            <w:tcW w:type="dxa" w:w="2880"/>
-          </w:tcPr>
-          <w:p>
-            <w:r>
-              <w:t>100.6</w:t>
-            </w:r>
-          </w:p>
-        </w:tc>
-      </w:tr>
-      <w:tr>
-        <w:tc>
-          <w:tcPr>
-            <w:tcW w:type="dxa" w:w="2880"/>
-          </w:tcPr>
-          <w:p>
-            <w:r>
-              <w:t>Total</w:t>
-            </w:r>
-          </w:p>
-        </w:tc>
-        <w:tc>
-          <w:tcPr>
-            <w:tcW w:type="dxa" w:w="2880"/>
-          </w:tcPr>
-          <w:p>
-            <w:r/>
-          </w:p>
-        </w:tc>
-        <w:tc>
-          <w:tcPr>
-            <w:tcW w:type="dxa" w:w="2880"/>
-          </w:tcPr>
-          <w:p>
-            <w:r>
-              <w:t>647.4</w:t>
-            </w:r>
-          </w:p>
-        </w:tc>
-      </w:tr>
-    </w:tbl>
     <w:p>
       <w:r>
         <w:rPr>

</xml_diff>

<commit_message>
Set AZ-MVS schedule to 4 weeks plus 1 week for returns/reschedules, with paired days when sites complement
Co-Authored-By: Devin AI <158243242+devin-ai-integration[bot]@users.noreply.github.com>
</commit_message>
<xml_diff>
--- a/docs/proposals/2026-08-11-az-mvs-asset-inventory/PROPOSAL.docx
+++ b/docs/proposals/2026-08-11-az-mvs-asset-inventory/PROPOSAL.docx
@@ -403,7 +403,7 @@
         <w:rPr>
           <w:b w:val="0"/>
         </w:rPr>
-        <w:t>Estimated duration: 4-6 weeks from kickoff to final deliverables, depending on the Client’s required completion date. Field work is planned as up to 24 business days at one site per day, grouped by geography to keep daily travel low. Two nearby sites may be paired on the same day if a tighter deadline is required. Weekend days may be used where site operating hours and security/access allow; weekend availability will be confirmed with each site contact during kickoff. Estimated assets per technician per day: 30-50 assets, varying by site density and access.</w:t>
+        <w:t>Estimated duration: 5-6 weeks from kickoff to final deliverables. Field work is planned as 4 weeks of Monday–Friday site visits, with one site per day. A second site may be added on the same day when two nearby locations complement each other and do not extend the technician beyond a normal workday. A 5th week is reserved for return visits, reschedules, and exception resolution covered by the $2,200 return-visit/contingency allowance. Weekend days may be used where site operating hours and security/access allow; weekend availability will be confirmed with each site contact during kickoff. Estimated assets per technician per day: 30-50 assets, varying by site density and access.</w:t>
       </w:r>
     </w:p>
     <w:p>
@@ -2010,7 +2010,7 @@
         <w:rPr>
           <w:b w:val="0"/>
         </w:rPr>
-        <w:t>Proposed field schedule: one site per business day over up to 24 working days, sequenced by geography to keep daily travel low. Weekend days may be added where the site allows access; weekend availability will be confirmed with each site contact during kickoff. If the Client needs a tighter completion date, two nearby sites may be paired on a single day. A detailed day-by-day schedule will be finalized with the Client during kickoff.</w:t>
+        <w:t>Proposed field schedule: 4 weeks of Monday–Friday site visits, one site per day, with a second site added on days when two nearby locations complement each other. Week 5 is reserved for return visits, reschedules, and exception resolution. Weekend access will be confirmed with each site contact during kickoff. A detailed day-by-day schedule will be finalized with the Client during kickoff.</w:t>
       </w:r>
     </w:p>
     <w:p>

</xml_diff>